<commit_message>
typos fixes, .gitattributes for pandoc and pptx2md utilization in git diff
</commit_message>
<xml_diff>
--- a/План курса лекций.docx
+++ b/План курса лекций.docx
@@ -1,6 +1,6 @@
 
 <file path=word/document.xml><?xml version="1.0" encoding="utf-8"?>
-<w:document xmlns:wpc="http://schemas.microsoft.com/office/word/2010/wordprocessingCanvas" xmlns:cx="http://schemas.microsoft.com/office/drawing/2014/chartex" xmlns:cx1="http://schemas.microsoft.com/office/drawing/2015/9/8/chartex" xmlns:cx2="http://schemas.microsoft.com/office/drawing/2015/10/21/chartex" xmlns:cx3="http://schemas.microsoft.com/office/drawing/2016/5/9/chartex" xmlns:cx4="http://schemas.microsoft.com/office/drawing/2016/5/10/chartex" xmlns:cx5="http://schemas.microsoft.com/office/drawing/2016/5/11/chartex" xmlns:cx6="http://schemas.microsoft.com/office/drawing/2016/5/12/chartex" xmlns:cx7="http://schemas.microsoft.com/office/drawing/2016/5/13/chartex" xmlns:cx8="http://schemas.microsoft.com/office/drawing/2016/5/14/chartex" xmlns:mc="http://schemas.openxmlformats.org/markup-compatibility/2006" xmlns:aink="http://schemas.microsoft.com/office/drawing/2016/ink" xmlns:am3d="http://schemas.microsoft.com/office/drawing/2017/model3d" xmlns:o="urn:schemas-microsoft-com:office:office" xmlns:r="http://schemas.openxmlformats.org/officeDocument/2006/relationships" xmlns:m="http://schemas.openxmlformats.org/officeDocument/2006/math" xmlns:v="urn:schemas-microsoft-com:vml" xmlns:wp14="http://schemas.microsoft.com/office/word/2010/wordprocessingDrawing" xmlns:wp="http://schemas.openxmlformats.org/drawingml/2006/wordprocessingDrawing" xmlns:w10="urn:schemas-microsoft-com:office:word" xmlns:w="http://schemas.openxmlformats.org/wordprocessingml/2006/main" xmlns:w14="http://schemas.microsoft.com/office/word/2010/wordml" xmlns:w15="http://schemas.microsoft.com/office/word/2012/wordml" xmlns:w16cex="http://schemas.microsoft.com/office/word/2018/wordml/cex" xmlns:w16cid="http://schemas.microsoft.com/office/word/2016/wordml/cid" xmlns:w16="http://schemas.microsoft.com/office/word/2018/wordml" xmlns:w16se="http://schemas.microsoft.com/office/word/2015/wordml/symex" xmlns:wpg="http://schemas.microsoft.com/office/word/2010/wordprocessingGroup" xmlns:wpi="http://schemas.microsoft.com/office/word/2010/wordprocessingInk" xmlns:wne="http://schemas.microsoft.com/office/word/2006/wordml" xmlns:wps="http://schemas.microsoft.com/office/word/2010/wordprocessingShape" mc:Ignorable="w14 w15 w16se w16cid w16 w16cex wp14">
+<w:document xmlns:wpc="http://schemas.microsoft.com/office/word/2010/wordprocessingCanvas" xmlns:cx="http://schemas.microsoft.com/office/drawing/2014/chartex" xmlns:cx1="http://schemas.microsoft.com/office/drawing/2015/9/8/chartex" xmlns:cx2="http://schemas.microsoft.com/office/drawing/2015/10/21/chartex" xmlns:cx3="http://schemas.microsoft.com/office/drawing/2016/5/9/chartex" xmlns:cx4="http://schemas.microsoft.com/office/drawing/2016/5/10/chartex" xmlns:cx5="http://schemas.microsoft.com/office/drawing/2016/5/11/chartex" xmlns:cx6="http://schemas.microsoft.com/office/drawing/2016/5/12/chartex" xmlns:cx7="http://schemas.microsoft.com/office/drawing/2016/5/13/chartex" xmlns:cx8="http://schemas.microsoft.com/office/drawing/2016/5/14/chartex" xmlns:mc="http://schemas.openxmlformats.org/markup-compatibility/2006" xmlns:aink="http://schemas.microsoft.com/office/drawing/2016/ink" xmlns:am3d="http://schemas.microsoft.com/office/drawing/2017/model3d" xmlns:o="urn:schemas-microsoft-com:office:office" xmlns:oel="http://schemas.microsoft.com/office/2019/extlst" xmlns:r="http://schemas.openxmlformats.org/officeDocument/2006/relationships" xmlns:m="http://schemas.openxmlformats.org/officeDocument/2006/math" xmlns:v="urn:schemas-microsoft-com:vml" xmlns:wp14="http://schemas.microsoft.com/office/word/2010/wordprocessingDrawing" xmlns:wp="http://schemas.openxmlformats.org/drawingml/2006/wordprocessingDrawing" xmlns:w10="urn:schemas-microsoft-com:office:word" xmlns:w="http://schemas.openxmlformats.org/wordprocessingml/2006/main" xmlns:w14="http://schemas.microsoft.com/office/word/2010/wordml" xmlns:w15="http://schemas.microsoft.com/office/word/2012/wordml" xmlns:w16cex="http://schemas.microsoft.com/office/word/2018/wordml/cex" xmlns:w16cid="http://schemas.microsoft.com/office/word/2016/wordml/cid" xmlns:w16="http://schemas.microsoft.com/office/word/2018/wordml" xmlns:w16sdtdh="http://schemas.microsoft.com/office/word/2020/wordml/sdtdatahash" xmlns:w16se="http://schemas.microsoft.com/office/word/2015/wordml/symex" xmlns:wpg="http://schemas.microsoft.com/office/word/2010/wordprocessingGroup" xmlns:wpi="http://schemas.microsoft.com/office/word/2010/wordprocessingInk" xmlns:wne="http://schemas.microsoft.com/office/word/2006/wordml" xmlns:wps="http://schemas.microsoft.com/office/word/2010/wordprocessingShape" mc:Ignorable="w14 w15 w16se w16cid w16 w16cex w16sdtdh wp14">
   <w:body>
     <w:p>
       <w:pPr>
@@ -1400,7 +1400,16 @@
             <w:rFonts w:ascii="Segoe UI" w:hAnsi="Segoe UI" w:cs="Segoe UI"/>
             <w:color w:val="0366D6"/>
           </w:rPr>
-          <w:t>Chen, Xi, Yan Duan, Rein Houthooft, John Schulman, Ilya Sutskever, and Pieter Abbeel. "Infogan: Interpretable representation learning by information maximizing generative adversarial nets." In Advances in neural information processing systems, pp. 2172-2180. 2016.</w:t>
+          <w:t xml:space="preserve">Chen, Xi, Yan Duan, Rein Houthooft, John Schulman, Ilya Sutskever, and Pieter Abbeel. "Infogan: Interpretable representation learning by information </w:t>
+        </w:r>
+        <w:r>
+          <w:rPr>
+            <w:rStyle w:val="Hyperlink"/>
+            <w:rFonts w:ascii="Segoe UI" w:hAnsi="Segoe UI" w:cs="Segoe UI"/>
+            <w:color w:val="0366D6"/>
+          </w:rPr>
+          <w:lastRenderedPageBreak/>
+          <w:t>maximizing generative adversarial nets." In Advances in neural information processing systems, pp. 2172-2180. 2016.</w:t>
         </w:r>
       </w:hyperlink>
     </w:p>
@@ -2769,21 +2778,19 @@
         <w:rPr>
           <w:lang w:val="ru-RU"/>
         </w:rPr>
-        <w:t xml:space="preserve">. </w:t>
-      </w:r>
-      <w:proofErr w:type="spellStart"/>
-      <w:r>
-        <w:rPr>
-          <w:lang w:val="ru-RU"/>
-        </w:rPr>
-        <w:t>Реккурентные</w:t>
-      </w:r>
-      <w:proofErr w:type="spellEnd"/>
-      <w:r>
-        <w:rPr>
-          <w:lang w:val="ru-RU"/>
-        </w:rPr>
-        <w:t xml:space="preserve"> нейронные сети в компьютерном зрении. </w:t>
+        <w:t>. Реку</w:t>
+      </w:r>
+      <w:r>
+        <w:rPr>
+          <w:lang w:val="ru-RU"/>
+        </w:rPr>
+        <w:t>р</w:t>
+      </w:r>
+      <w:r>
+        <w:rPr>
+          <w:lang w:val="ru-RU"/>
+        </w:rPr>
+        <w:t xml:space="preserve">рентные нейронные сети в компьютерном зрении. </w:t>
       </w:r>
       <w:r>
         <w:t>GRU, LSTM, visual question answering</w:t>
@@ -2836,7 +2843,7 @@
 </file>
 
 <file path=word/numbering.xml><?xml version="1.0" encoding="utf-8"?>
-<w:numbering xmlns:wpc="http://schemas.microsoft.com/office/word/2010/wordprocessingCanvas" xmlns:cx="http://schemas.microsoft.com/office/drawing/2014/chartex" xmlns:cx1="http://schemas.microsoft.com/office/drawing/2015/9/8/chartex" xmlns:cx2="http://schemas.microsoft.com/office/drawing/2015/10/21/chartex" xmlns:cx3="http://schemas.microsoft.com/office/drawing/2016/5/9/chartex" xmlns:cx4="http://schemas.microsoft.com/office/drawing/2016/5/10/chartex" xmlns:cx5="http://schemas.microsoft.com/office/drawing/2016/5/11/chartex" xmlns:cx6="http://schemas.microsoft.com/office/drawing/2016/5/12/chartex" xmlns:cx7="http://schemas.microsoft.com/office/drawing/2016/5/13/chartex" xmlns:cx8="http://schemas.microsoft.com/office/drawing/2016/5/14/chartex" xmlns:mc="http://schemas.openxmlformats.org/markup-compatibility/2006" xmlns:aink="http://schemas.microsoft.com/office/drawing/2016/ink" xmlns:am3d="http://schemas.microsoft.com/office/drawing/2017/model3d" xmlns:o="urn:schemas-microsoft-com:office:office" xmlns:r="http://schemas.openxmlformats.org/officeDocument/2006/relationships" xmlns:m="http://schemas.openxmlformats.org/officeDocument/2006/math" xmlns:v="urn:schemas-microsoft-com:vml" xmlns:wp14="http://schemas.microsoft.com/office/word/2010/wordprocessingDrawing" xmlns:wp="http://schemas.openxmlformats.org/drawingml/2006/wordprocessingDrawing" xmlns:w10="urn:schemas-microsoft-com:office:word" xmlns:w="http://schemas.openxmlformats.org/wordprocessingml/2006/main" xmlns:w14="http://schemas.microsoft.com/office/word/2010/wordml" xmlns:w15="http://schemas.microsoft.com/office/word/2012/wordml" xmlns:w16cex="http://schemas.microsoft.com/office/word/2018/wordml/cex" xmlns:w16cid="http://schemas.microsoft.com/office/word/2016/wordml/cid" xmlns:w16="http://schemas.microsoft.com/office/word/2018/wordml" xmlns:w16se="http://schemas.microsoft.com/office/word/2015/wordml/symex" xmlns:wpg="http://schemas.microsoft.com/office/word/2010/wordprocessingGroup" xmlns:wpi="http://schemas.microsoft.com/office/word/2010/wordprocessingInk" xmlns:wne="http://schemas.microsoft.com/office/word/2006/wordml" xmlns:wps="http://schemas.microsoft.com/office/word/2010/wordprocessingShape" mc:Ignorable="w14 w15 w16se w16cid w16 w16cex wp14">
+<w:numbering xmlns:wpc="http://schemas.microsoft.com/office/word/2010/wordprocessingCanvas" xmlns:cx="http://schemas.microsoft.com/office/drawing/2014/chartex" xmlns:cx1="http://schemas.microsoft.com/office/drawing/2015/9/8/chartex" xmlns:cx2="http://schemas.microsoft.com/office/drawing/2015/10/21/chartex" xmlns:cx3="http://schemas.microsoft.com/office/drawing/2016/5/9/chartex" xmlns:cx4="http://schemas.microsoft.com/office/drawing/2016/5/10/chartex" xmlns:cx5="http://schemas.microsoft.com/office/drawing/2016/5/11/chartex" xmlns:cx6="http://schemas.microsoft.com/office/drawing/2016/5/12/chartex" xmlns:cx7="http://schemas.microsoft.com/office/drawing/2016/5/13/chartex" xmlns:cx8="http://schemas.microsoft.com/office/drawing/2016/5/14/chartex" xmlns:mc="http://schemas.openxmlformats.org/markup-compatibility/2006" xmlns:aink="http://schemas.microsoft.com/office/drawing/2016/ink" xmlns:am3d="http://schemas.microsoft.com/office/drawing/2017/model3d" xmlns:o="urn:schemas-microsoft-com:office:office" xmlns:oel="http://schemas.microsoft.com/office/2019/extlst" xmlns:r="http://schemas.openxmlformats.org/officeDocument/2006/relationships" xmlns:m="http://schemas.openxmlformats.org/officeDocument/2006/math" xmlns:v="urn:schemas-microsoft-com:vml" xmlns:wp14="http://schemas.microsoft.com/office/word/2010/wordprocessingDrawing" xmlns:wp="http://schemas.openxmlformats.org/drawingml/2006/wordprocessingDrawing" xmlns:w10="urn:schemas-microsoft-com:office:word" xmlns:w="http://schemas.openxmlformats.org/wordprocessingml/2006/main" xmlns:w14="http://schemas.microsoft.com/office/word/2010/wordml" xmlns:w15="http://schemas.microsoft.com/office/word/2012/wordml" xmlns:w16cex="http://schemas.microsoft.com/office/word/2018/wordml/cex" xmlns:w16cid="http://schemas.microsoft.com/office/word/2016/wordml/cid" xmlns:w16="http://schemas.microsoft.com/office/word/2018/wordml" xmlns:w16sdtdh="http://schemas.microsoft.com/office/word/2020/wordml/sdtdatahash" xmlns:w16se="http://schemas.microsoft.com/office/word/2015/wordml/symex" xmlns:wpg="http://schemas.microsoft.com/office/word/2010/wordprocessingGroup" xmlns:wpi="http://schemas.microsoft.com/office/word/2010/wordprocessingInk" xmlns:wne="http://schemas.microsoft.com/office/word/2006/wordml" xmlns:wps="http://schemas.microsoft.com/office/word/2010/wordprocessingShape" mc:Ignorable="w14 w15 w16se w16cid w16 w16cex w16sdtdh wp14">
   <w:abstractNum w:abstractNumId="0" w15:restartNumberingAfterBreak="0">
     <w:nsid w:val="0B7E19ED"/>
     <w:multiLevelType w:val="multilevel"/>
@@ -3645,35 +3652,35 @@
       </w:pPr>
     </w:lvl>
   </w:abstractNum>
-  <w:num w:numId="1">
+  <w:num w:numId="1" w16cid:durableId="712316053">
     <w:abstractNumId w:val="7"/>
   </w:num>
-  <w:num w:numId="2">
+  <w:num w:numId="2" w16cid:durableId="717433964">
     <w:abstractNumId w:val="2"/>
   </w:num>
-  <w:num w:numId="3">
+  <w:num w:numId="3" w16cid:durableId="943801031">
     <w:abstractNumId w:val="3"/>
   </w:num>
-  <w:num w:numId="4">
+  <w:num w:numId="4" w16cid:durableId="1169563271">
     <w:abstractNumId w:val="1"/>
   </w:num>
-  <w:num w:numId="5">
+  <w:num w:numId="5" w16cid:durableId="1333988250">
     <w:abstractNumId w:val="6"/>
   </w:num>
-  <w:num w:numId="6">
+  <w:num w:numId="6" w16cid:durableId="1337149968">
     <w:abstractNumId w:val="4"/>
   </w:num>
-  <w:num w:numId="7">
+  <w:num w:numId="7" w16cid:durableId="517348526">
     <w:abstractNumId w:val="5"/>
   </w:num>
-  <w:num w:numId="8">
+  <w:num w:numId="8" w16cid:durableId="424153379">
     <w:abstractNumId w:val="0"/>
   </w:num>
 </w:numbering>
 </file>
 
 <file path=word/styles.xml><?xml version="1.0" encoding="utf-8"?>
-<w:styles xmlns:mc="http://schemas.openxmlformats.org/markup-compatibility/2006" xmlns:r="http://schemas.openxmlformats.org/officeDocument/2006/relationships" xmlns:w="http://schemas.openxmlformats.org/wordprocessingml/2006/main" xmlns:w14="http://schemas.microsoft.com/office/word/2010/wordml" xmlns:w15="http://schemas.microsoft.com/office/word/2012/wordml" xmlns:w16cex="http://schemas.microsoft.com/office/word/2018/wordml/cex" xmlns:w16cid="http://schemas.microsoft.com/office/word/2016/wordml/cid" xmlns:w16="http://schemas.microsoft.com/office/word/2018/wordml" xmlns:w16se="http://schemas.microsoft.com/office/word/2015/wordml/symex" mc:Ignorable="w14 w15 w16se w16cid w16 w16cex">
+<w:styles xmlns:mc="http://schemas.openxmlformats.org/markup-compatibility/2006" xmlns:r="http://schemas.openxmlformats.org/officeDocument/2006/relationships" xmlns:w="http://schemas.openxmlformats.org/wordprocessingml/2006/main" xmlns:w14="http://schemas.microsoft.com/office/word/2010/wordml" xmlns:w15="http://schemas.microsoft.com/office/word/2012/wordml" xmlns:w16cex="http://schemas.microsoft.com/office/word/2018/wordml/cex" xmlns:w16cid="http://schemas.microsoft.com/office/word/2016/wordml/cid" xmlns:w16="http://schemas.microsoft.com/office/word/2018/wordml" xmlns:w16sdtdh="http://schemas.microsoft.com/office/word/2020/wordml/sdtdatahash" xmlns:w16se="http://schemas.microsoft.com/office/word/2015/wordml/symex" mc:Ignorable="w14 w15 w16se w16cid w16 w16cex w16sdtdh">
   <w:docDefaults>
     <w:rPrDefault>
       <w:rPr>

</xml_diff>